<commit_message>
Adopt the candidate's final CV wording with three corrections
Takes her revised bullets and section labels verbatim, and fixes:

- "Independent Economic Researcher - Independent" repeated the employer
  word and diverged from the title her LinkedIn headline claims; restored
  to "Economic Research Analyst - Independent" so the two documents agree.
- The opening sentence used "experience" twice.
- Languages had been changed to "English (fluent)"; her prior CV states
  native for both, and the inconsistency is worth more than the hedge on an
  English-language application. Reverted, and flagged as hers to overrule.

Co-Authored-By: Claude Opus 5 <noreply@anthropic.com>
Claude-Session: https://claude.ai/code/session_01Q3nrqaiut7yZEUxwYzX2YE
</commit_message>
<xml_diff>
--- a/career/rayda-data-analyst-intern/Peace-Sossa-CV-Data-Analyst.docx
+++ b/career/rayda-data-analyst-intern/Peace-Sossa-CV-Data-Analyst.docx
@@ -61,7 +61,7 @@
           <w:sz w:val="20"/>
           <w:szCs w:val="20"/>
         </w:rPr>
-        <w:t xml:space="preserve">Economics undergraduate (CGPA 4.53/5.00) with 17 months of fully remote work building, cleaning and verifying datasets from public financial sources. Excel, SQL and Power BI. Native English and French.</w:t>
+        <w:t xml:space="preserve">Economics undergraduate (CGPA 4.53/5.00) with 17 months of fully remote work cleaning, validating and analysing multi-source financial datasets. Skilled in Excel, SQL/MySQL, Power BI and Tableau, with a focus on data quality, documentation and clear reporting.</w:t>
       </w:r>
     </w:p>
     <w:p>
@@ -137,61 +137,61 @@
           <w:sz w:val="20"/>
           <w:szCs w:val="20"/>
         </w:rPr>
-        <w:t xml:space="preserve">Pull and clean financial datasets from six sources with inconsistent definitions and formats — IMF Financial Access Survey via FRED, NIBSS, Central Bank of Nigeria, EFInA and GSMA — reconciling them into comparable series.</w:t>
-      </w:r>
-    </w:p>
-    <w:p>
-      <w:pPr>
-        <w:pStyle w:val="ListParagraph"/>
-        <w:numPr>
-          <w:ilvl w:val="0"/>
-          <w:numId w:val="2"/>
-        </w:numPr>
-        <w:spacing w:after="40" w:line="250"/>
-      </w:pPr>
-      <w:r>
-        <w:rPr>
-          <w:rFonts w:ascii="Times New Roman" w:cs="Times New Roman" w:eastAsia="Times New Roman" w:hAnsi="Times New Roman"/>
-          <w:sz w:val="20"/>
-          <w:szCs w:val="20"/>
-        </w:rPr>
-        <w:t xml:space="preserve">Verify every figure against its primary source before publication, documenting methodology, benchmarks and limitations so any reader can re-run the analysis.</w:t>
-      </w:r>
-    </w:p>
-    <w:p>
-      <w:pPr>
-        <w:pStyle w:val="ListParagraph"/>
-        <w:numPr>
-          <w:ilvl w:val="0"/>
-          <w:numId w:val="2"/>
-        </w:numPr>
-        <w:spacing w:after="40" w:line="250"/>
-      </w:pPr>
-      <w:r>
-        <w:rPr>
-          <w:rFonts w:ascii="Times New Roman" w:cs="Times New Roman" w:eastAsia="Times New Roman" w:hAnsi="Times New Roman"/>
-          <w:sz w:val="20"/>
-          <w:szCs w:val="20"/>
-        </w:rPr>
-        <w:t xml:space="preserve">Published a study on Nigerian mobile money (July 2026) showing that a third-place regional rank by account count masks the lowest per-capita penetration in the region.</w:t>
-      </w:r>
-    </w:p>
-    <w:p>
-      <w:pPr>
-        <w:pStyle w:val="ListParagraph"/>
-        <w:numPr>
-          <w:ilvl w:val="0"/>
-          <w:numId w:val="2"/>
-        </w:numPr>
-        <w:spacing w:after="40" w:line="250"/>
-      </w:pPr>
-      <w:r>
-        <w:rPr>
-          <w:rFonts w:ascii="Times New Roman" w:cs="Times New Roman" w:eastAsia="Times New Roman" w:hAnsi="Times New Roman"/>
-          <w:sz w:val="20"/>
-          <w:szCs w:val="20"/>
-        </w:rPr>
-        <w:t xml:space="preserve">Documented the registered-versus-active account distinction that secondary coverage routinely conflates, correcting a recurring misreading of the data.</w:t>
+        <w:t xml:space="preserve">Pull and clean financial datasets from multiple institutional sources, including the IMF Financial Access Survey via FRED, NIBSS, the Central Bank of Nigeria, EFInA and GSMA, reconciling inconsistent definitions and formats into comparable series.</w:t>
+      </w:r>
+    </w:p>
+    <w:p>
+      <w:pPr>
+        <w:pStyle w:val="ListParagraph"/>
+        <w:numPr>
+          <w:ilvl w:val="0"/>
+          <w:numId w:val="2"/>
+        </w:numPr>
+        <w:spacing w:after="40" w:line="250"/>
+      </w:pPr>
+      <w:r>
+        <w:rPr>
+          <w:rFonts w:ascii="Times New Roman" w:cs="Times New Roman" w:eastAsia="Times New Roman" w:hAnsi="Times New Roman"/>
+          <w:sz w:val="20"/>
+          <w:szCs w:val="20"/>
+        </w:rPr>
+        <w:t xml:space="preserve">Validate figures against primary sources before publication and document methodology, benchmarks and limitations so the analysis can be checked and reproduced.</w:t>
+      </w:r>
+    </w:p>
+    <w:p>
+      <w:pPr>
+        <w:pStyle w:val="ListParagraph"/>
+        <w:numPr>
+          <w:ilvl w:val="0"/>
+          <w:numId w:val="2"/>
+        </w:numPr>
+        <w:spacing w:after="40" w:line="250"/>
+      </w:pPr>
+      <w:r>
+        <w:rPr>
+          <w:rFonts w:ascii="Times New Roman" w:cs="Times New Roman" w:eastAsia="Times New Roman" w:hAnsi="Times New Roman"/>
+          <w:sz w:val="20"/>
+          <w:szCs w:val="20"/>
+        </w:rPr>
+        <w:t xml:space="preserve">Published a July 2026 study on Nigeria's mobile money market showing that a third-place regional rank by account count masks the lowest per-capita penetration among the markets compared.</w:t>
+      </w:r>
+    </w:p>
+    <w:p>
+      <w:pPr>
+        <w:pStyle w:val="ListParagraph"/>
+        <w:numPr>
+          <w:ilvl w:val="0"/>
+          <w:numId w:val="2"/>
+        </w:numPr>
+        <w:spacing w:after="40" w:line="250"/>
+      </w:pPr>
+      <w:r>
+        <w:rPr>
+          <w:rFonts w:ascii="Times New Roman" w:cs="Times New Roman" w:eastAsia="Times New Roman" w:hAnsi="Times New Roman"/>
+          <w:sz w:val="20"/>
+          <w:szCs w:val="20"/>
+        </w:rPr>
+        <w:t xml:space="preserve">Identified and documented the distinction between registered and active accounts, preventing a common misreading of market size.</w:t>
       </w:r>
     </w:p>
     <w:p>
@@ -247,7 +247,7 @@
           <w:sz w:val="20"/>
           <w:szCs w:val="20"/>
         </w:rPr>
-        <w:t xml:space="preserve">Track distribution sales and expenses, reconcile cash against records, and report results to the Director monthly.</w:t>
+        <w:t xml:space="preserve">Track distribution sales and expenses, reconcile cash against records, and report monthly results to the Director.</w:t>
       </w:r>
     </w:p>
     <w:p>
@@ -275,7 +275,7 @@
           <w:sz w:val="20"/>
           <w:szCs w:val="20"/>
         </w:rPr>
-        <w:t xml:space="preserve">16 consecutive cycles</w:t>
+        <w:t xml:space="preserve">16 consecutive reporting cycles</w:t>
       </w:r>
       <w:r>
         <w:rPr>
@@ -301,7 +301,7 @@
           <w:sz w:val="20"/>
           <w:szCs w:val="20"/>
         </w:rPr>
-        <w:t xml:space="preserve">Build reports and slide decks used in international meetings and public dissemination, working from source documentation.</w:t>
+        <w:t xml:space="preserve">Prepare reports and slide decks for international meetings and public dissemination using source documentation collected across projects.</w:t>
       </w:r>
     </w:p>
     <w:p>
@@ -359,15 +359,15 @@
           <w:sz w:val="20"/>
           <w:szCs w:val="20"/>
         </w:rPr>
-        <w:t xml:space="preserve">Skills: </w:t>
-      </w:r>
-      <w:r>
-        <w:rPr>
-          <w:rFonts w:ascii="Times New Roman" w:cs="Times New Roman" w:eastAsia="Times New Roman" w:hAnsi="Times New Roman"/>
-          <w:sz w:val="20"/>
-          <w:szCs w:val="20"/>
-        </w:rPr>
-        <w:t xml:space="preserve">Data cleaning and reconciliation · Validation against primary sources · Descriptive statistics, probability and sampling · Methodology documentation · Report and dashboard production</w:t>
+        <w:t xml:space="preserve">Data: </w:t>
+      </w:r>
+      <w:r>
+        <w:rPr>
+          <w:rFonts w:ascii="Times New Roman" w:cs="Times New Roman" w:eastAsia="Times New Roman" w:hAnsi="Times New Roman"/>
+          <w:sz w:val="20"/>
+          <w:szCs w:val="20"/>
+        </w:rPr>
+        <w:t xml:space="preserve">Data cleaning and reconciliation · Data validation · Descriptive statistics · Probability and sampling · Methodology documentation · Report and dashboard production</w:t>
       </w:r>
     </w:p>
     <w:p>
@@ -591,7 +591,7 @@
           <w:sz w:val="20"/>
           <w:szCs w:val="20"/>
         </w:rPr>
-        <w:t xml:space="preserve">Licence 1, Mathématiques, Informatique et Applications</w:t>
+        <w:t xml:space="preserve">Mathématiques, Informatique et Applications (L1)</w:t>
       </w:r>
       <w:r>
         <w:rPr>

</xml_diff>